<commit_message>
[EAbrakhin] Multiprocessing_Spase_Image report fixed.
</commit_message>
<xml_diff>
--- a/Multiprocessing_Spase_Image/Отчет.docx
+++ b/Multiprocessing_Spase_Image/Отчет.docx
@@ -627,23 +627,8 @@
           <w:b/>
           <w:sz w:val="28"/>
         </w:rPr>
-        <w:t>Дик А.Г.</w:t>
-      </w:r>
-    </w:p>
-    <w:p>
-      <w:pPr>
-        <w:tabs>
-          <w:tab w:val="left" w:pos="4355"/>
-        </w:tabs>
-        <w:spacing w:after="0" w:line="240" w:lineRule="auto"/>
-        <w:ind w:left="360"/>
-        <w:jc w:val="right"/>
-        <w:rPr>
-          <w:rFonts w:ascii="Times New Roman" w:hAnsi="Times New Roman"/>
-          <w:b/>
-          <w:sz w:val="28"/>
-        </w:rPr>
-      </w:pPr>
+        <w:t>Киямов Ж. У.</w:t>
+      </w:r>
     </w:p>
     <w:p>
       <w:pPr>
@@ -1540,21 +1525,7 @@
           <w:rFonts w:ascii="Times New Roman" w:hAnsi="Times New Roman"/>
           <w:sz w:val="28"/>
         </w:rPr>
-        <w:t xml:space="preserve">Необходимо разработать программное обеспечение для анализа данных с космического телескопа с использованием параллельных вычислений. Входные данные представляют собой наборы изображений, где каждое изображение </w:t>
-      </w:r>
-      <w:r>
-        <w:rPr>
-          <w:rFonts w:ascii="Times New Roman" w:hAnsi="Times New Roman"/>
-          <w:sz w:val="28"/>
-        </w:rPr>
-        <w:t>— это</w:t>
-      </w:r>
-      <w:r>
-        <w:rPr>
-          <w:rFonts w:ascii="Times New Roman" w:hAnsi="Times New Roman"/>
-          <w:sz w:val="28"/>
-        </w:rPr>
-        <w:t xml:space="preserve"> матрица пикселей, содержащая информацию о космических объектах. Основная цель анализа заключается в автоматическом выявлении астрофизических объектов на изображениях и сборе их характеристик.</w:t>
+        <w:t>Необходимо разработать программное обеспечение для анализа данных с космического телескопа с использованием параллельных вычислений. Входные данные представляют собой наборы изображений, где каждое изображение — это матрица пикселей, содержащая информацию о космических объектах. Основная цель анализа заключается в автоматическом выявлении астрофизических объектов на изображениях и сборе их характеристик.</w:t>
       </w:r>
     </w:p>
     <w:p>
@@ -1951,19 +1922,13 @@
         <w:spacing w:after="120"/>
       </w:pPr>
       <w:r>
-        <w:t>Преобразование цветового пространства</w:t>
-      </w:r>
-      <w:r>
-        <w:t xml:space="preserve">: </w:t>
+        <w:t xml:space="preserve">Преобразование цветового пространства: </w:t>
       </w:r>
       <w:r>
         <w:t>Д</w:t>
       </w:r>
       <w:r>
-        <w:t>ля</w:t>
-      </w:r>
-      <w:r>
-        <w:t xml:space="preserve"> упрощения анализа изображения часто выполняется преобразование в градации серого. Это помогает уменьшить сложность обработки, так как из трех цветовых каналов (RGB) остается только один.</w:t>
+        <w:t>ля упрощения анализа изображения часто выполняется преобразование в градации серого. Это помогает уменьшить сложность обработки, так как из трех цветовых каналов (RGB) остается только один.</w:t>
       </w:r>
     </w:p>
     <w:p>
@@ -2016,15 +1981,7 @@
         <w:spacing w:after="120"/>
       </w:pPr>
       <w:r>
-        <w:t>Измерение характеристик</w:t>
-      </w:r>
-      <w:proofErr w:type="gramStart"/>
-      <w:r>
-        <w:t>: После</w:t>
-      </w:r>
-      <w:proofErr w:type="gramEnd"/>
-      <w:r>
-        <w:t xml:space="preserve"> выделения контуров необходимо измерить различные характеристики объектов, такие как площадь, координаты, яркость и другие параметры, которые могут быть использованы для классификации.</w:t>
+        <w:t>Измерение характеристик: После выделения контуров необходимо измерить различные характеристики объектов, такие как площадь, координаты, яркость и другие параметры, которые могут быть использованы для классификации.</w:t>
       </w:r>
     </w:p>
     <w:p>
@@ -3444,7 +3401,7 @@
         <w:rPr>
           <w:szCs w:val="28"/>
         </w:rPr>
-        <w:t>Для успешного запуска программы убедитесь, что у вас установлен Python и необходимые библиотеки, такие как csv, cv2, numpy, и multiprocessing. Все файлы программы должны находиться в одной директории для корректного выполнения. Программа позволяет обрабатывать изображения и выявлять астрофизические объекты на основе их характеристик.</w:t>
+        <w:t>Программа позволяет обрабатывать изображения и выявлять астрофизические объекты на основе их характеристик.</w:t>
       </w:r>
     </w:p>
     <w:p>
@@ -3496,9 +3453,59 @@
     <w:p>
       <w:pPr>
         <w:pStyle w:val="a3"/>
-        <w:rPr>
-          <w:lang w:val="en-US"/>
-        </w:rPr>
+      </w:pPr>
+      <w:r>
+        <w:rPr>
+          <w:szCs w:val="28"/>
+        </w:rPr>
+        <w:t xml:space="preserve">Для успешного запуска программы убедитесь, что у вас установлен Python и необходимые библиотеки, такие как </w:t>
+      </w:r>
+      <w:proofErr w:type="spellStart"/>
+      <w:r>
+        <w:rPr>
+          <w:szCs w:val="28"/>
+        </w:rPr>
+        <w:t>csv</w:t>
+      </w:r>
+      <w:proofErr w:type="spellEnd"/>
+      <w:r>
+        <w:rPr>
+          <w:szCs w:val="28"/>
+        </w:rPr>
+        <w:t xml:space="preserve">, cv2, </w:t>
+      </w:r>
+      <w:proofErr w:type="spellStart"/>
+      <w:r>
+        <w:rPr>
+          <w:szCs w:val="28"/>
+        </w:rPr>
+        <w:t>numpy</w:t>
+      </w:r>
+      <w:proofErr w:type="spellEnd"/>
+      <w:r>
+        <w:rPr>
+          <w:szCs w:val="28"/>
+        </w:rPr>
+        <w:t xml:space="preserve">, и </w:t>
+      </w:r>
+      <w:proofErr w:type="spellStart"/>
+      <w:r>
+        <w:rPr>
+          <w:szCs w:val="28"/>
+        </w:rPr>
+        <w:t>multiprocessing</w:t>
+      </w:r>
+      <w:proofErr w:type="spellEnd"/>
+      <w:r>
+        <w:rPr>
+          <w:szCs w:val="28"/>
+        </w:rPr>
+        <w:t>. Все файлы программы должны находиться в одной директории для корректного выполнения.</w:t>
+      </w:r>
+    </w:p>
+    <w:p>
+      <w:pPr>
+        <w:pStyle w:val="a3"/>
       </w:pPr>
       <w:r>
         <w:t>Поддерживайте актуальные версии используемых библиотек и Python для обеспечения работоспособности программы на современных системах. Следуйте передовым практикам разработки, уделяя внимание четкому именованию переменных и функций, чтобы улучшить читаемость и понимание кода.</w:t>
@@ -3740,19 +3747,7 @@
         <w:t>astroObjectsStatistics.csv</w:t>
       </w:r>
       <w:r>
-        <w:t xml:space="preserve"> в своей директории </w:t>
-      </w:r>
-      <w:r>
-        <w:t xml:space="preserve">(Рис. </w:t>
-      </w:r>
-      <w:r>
-        <w:t>2</w:t>
-      </w:r>
-      <w:r>
-        <w:t>)</w:t>
-      </w:r>
-      <w:r>
-        <w:t>.</w:t>
+        <w:t xml:space="preserve"> в своей директории (Рис. 2).</w:t>
       </w:r>
     </w:p>
     <w:p>
@@ -3962,23 +3957,7 @@
           <w:color w:val="000000"/>
           <w:sz w:val="24"/>
         </w:rPr>
-        <w:t xml:space="preserve">вывода программы </w:t>
-      </w:r>
-      <w:r>
-        <w:rPr>
-          <w:rFonts w:ascii="Times New Roman" w:hAnsi="Times New Roman"/>
-          <w:color w:val="000000"/>
-          <w:sz w:val="24"/>
-        </w:rPr>
-        <w:t>по завершении</w:t>
-      </w:r>
-      <w:r>
-        <w:rPr>
-          <w:rFonts w:ascii="Times New Roman" w:hAnsi="Times New Roman"/>
-          <w:color w:val="000000"/>
-          <w:sz w:val="24"/>
-        </w:rPr>
-        <w:t xml:space="preserve"> выполнения</w:t>
+        <w:t>вывода программы по завершении выполнения</w:t>
       </w:r>
     </w:p>
     <w:p>
@@ -10899,6 +10878,7 @@
   <w:style w:type="character" w:default="1" w:styleId="a0">
     <w:name w:val="Default Paragraph Font"/>
     <w:uiPriority w:val="1"/>
+    <w:semiHidden/>
     <w:unhideWhenUsed/>
   </w:style>
   <w:style w:type="table" w:default="1" w:styleId="a1">

</xml_diff>